<commit_message>
Lula: Parte 1 reescrita
Co-Authored-By: Claude Opus 5.5 <noreply@anthropic.com>
Claude-Session: https://claude.ai/code/session_01MJjUEEZrxQDEUifKK2vj9g
</commit_message>
<xml_diff>
--- a/roteiros/lula/Lula_Parte1.docx
+++ b/roteiros/lula/Lula_Parte1.docx
@@ -39,7 +39,7 @@
         <w:rPr>
           <w:color w:val="000000"/>
         </w:rPr>
-        <w:t>Mas, para entender por que aquelas duas notícias pesaram tanto, é preciso voltar muito antes de Curitiba. Porque a primeira vez que a morte entrou na vida de Lula sem pedir licença, ele tinha só vinte e cinco anos.</w:t>
+        <w:t>Só que essa não foi a primeira vez que Lula chegou tarde demais para alguém que ele amava. A primeira aconteceu num corredor de hospital, quando ele tinha vinte e cinco anos. E o que ele encontrou ali marcou o resto da vida dele.</w:t>
       </w:r>
     </w:p>
     <w:p>
@@ -47,7 +47,7 @@
         <w:rPr>
           <w:color w:val="000000"/>
         </w:rPr>
-        <w:t>Vinte e sete de outubro de mil novecentos e quarenta e cinco.</w:t>
+        <w:t>Para chegar até esse corredor, é preciso voltar ao sertão de Pernambuco.</w:t>
       </w:r>
     </w:p>
     <w:p>
@@ -55,7 +55,7 @@
         <w:rPr>
           <w:color w:val="000000"/>
         </w:rPr>
-        <w:t>No interior de Pernambuco, num lugarejo chamado Caetés, que naquela época pertencia ao município de Garanhuns, nasceu Luiz Inácio da Silva.</w:t>
+        <w:t>Lula nasceu em mil novecentos e quarenta e cinco, num lugarejo chamado Caetés, perto de Garanhuns. Foi o sétimo filho de uma mulher que o Brasil inteiro, anos depois, ia conhecer como Dona Lindu.</w:t>
       </w:r>
     </w:p>
     <w:p>
@@ -63,7 +63,7 @@
         <w:rPr>
           <w:color w:val="000000"/>
         </w:rPr>
-        <w:t>Era o sétimo de oito filhos de Eurídice Ferreira de Melo. Na família, todo mundo chamava a mãe de Dona Lindu.</w:t>
+        <w:t>O pai não estava lá para ver.</w:t>
       </w:r>
     </w:p>
     <w:p>
@@ -71,7 +71,7 @@
         <w:rPr>
           <w:color w:val="000000"/>
         </w:rPr>
-        <w:t>O pai, Aristides, não estava lá.</w:t>
+        <w:t>Antes de o menino nascer, Aristides tinha ido embora para Santos, trabalhar no porto. Foi com outra mulher. Com ela, teve mais dez filhos.</w:t>
       </w:r>
     </w:p>
     <w:p>
@@ -79,7 +79,7 @@
         <w:rPr>
           <w:color w:val="000000"/>
         </w:rPr>
-        <w:t>Antes de Lula nascer, ele tinha ido embora para Santos, no litoral de São Paulo, trabalhar como estivador no porto. E não foi sozinho. Levou junto outra mulher, com quem ainda teria mais dez filhos.</w:t>
+        <w:t>Lula cresceu sem saber o rosto do próprio pai. E com fome.</w:t>
       </w:r>
     </w:p>
     <w:p>
@@ -87,7 +87,31 @@
         <w:rPr>
           <w:color w:val="000000"/>
         </w:rPr>
-        <w:t>O menino cresceu sem conhecer o pai. No sertão, a família passava fome.</w:t>
+        <w:t>Quando ele tinha sete anos, Dona Lindu cansou de esperar.</w:t>
+      </w:r>
+    </w:p>
+    <w:p>
+      <w:r>
+        <w:rPr>
+          <w:color w:val="000000"/>
+        </w:rPr>
+        <w:t>Em dezembro de mil novecentos e cinquenta e dois, ela juntou as crianças e subiu na carroceria de um caminhão pau de arara. Gente amontoada, segurando nas tábuas, atravessando o Brasil de norte a sul. Foram treze dias de estrada.</w:t>
+      </w:r>
+    </w:p>
+    <w:p>
+      <w:r>
+        <w:rPr>
+          <w:color w:val="000000"/>
+        </w:rPr>
+        <w:t>No fim da viagem, Dona Lindu encontrou o marido.</w:t>
+      </w:r>
+    </w:p>
+    <w:p>
+      <w:r>
+        <w:rPr>
+          <w:color w:val="000000"/>
+        </w:rPr>
+        <w:t>E encontrou a outra família dele.</w:t>
       </w:r>
     </w:p>
     <w:p>
@@ -95,7 +119,7 @@
         <w:rPr>
           <w:color w:val="C00000"/>
         </w:rPr>
-        <w:t>Guarde esse começo. Um menino que cresceu sem o pai por perto e com fome. Porque, muitos anos depois, esse mesmo menino ia estar trancado numa cela, sem poder estar perto da própria família no momento em que ela mais precisou dele.</w:t>
+        <w:t>Imagine ser uma criança de sete anos, viajar treze dias para encontrar o pai, e descobrir que ele tinha outra casa, outra mulher e outros filhos. Esse foi o primeiro abandono da vida de Lula. Mas estava longe de ser o pior.</w:t>
       </w:r>
     </w:p>
     <w:p>
@@ -103,7 +127,7 @@
         <w:rPr>
           <w:color w:val="000000"/>
         </w:rPr>
-        <w:t>Dezembro de mil novecentos e cinquenta e dois.</w:t>
+        <w:t>Dona Lindu não ficou. Pouco tempo depois, levou os filhos para São Paulo e criou todos praticamente sozinha.</w:t>
       </w:r>
     </w:p>
     <w:p>
@@ -111,7 +135,7 @@
         <w:rPr>
           <w:color w:val="000000"/>
         </w:rPr>
-        <w:t>Dona Lindu tomou uma decisão.</w:t>
+        <w:t>Lula começou a trabalhar com oito anos. Vendia coisas perto do cais do porto e entrava no mangue atrás de marisco para ajudar em casa.</w:t>
       </w:r>
     </w:p>
     <w:p>
@@ -119,7 +143,7 @@
         <w:rPr>
           <w:color w:val="000000"/>
         </w:rPr>
-        <w:t>Juntou os filhos e subiu num caminhão pau de arara, aquele tipo de caminhão em que as pessoas viajavam amontoadas na carroceria, segurando nas tábuas. O destino era o litoral paulista, onde estava o marido.</w:t>
+        <w:t>Na adolescência, conseguiu uma vaga no SENAI e virou torneiro mecânico. Era o primeiro diploma da família.</w:t>
       </w:r>
     </w:p>
     <w:p>
@@ -127,7 +151,7 @@
         <w:rPr>
           <w:color w:val="000000"/>
         </w:rPr>
-        <w:t>Lula tinha sete anos.</w:t>
+        <w:t>Mas a fábrica cobrou um preço logo cedo.</w:t>
       </w:r>
     </w:p>
     <w:p>
@@ -135,7 +159,7 @@
         <w:rPr>
           <w:color w:val="000000"/>
         </w:rPr>
-        <w:t>A viagem durou treze dias.</w:t>
+        <w:t>Em mil novecentos e sessenta e quatro, aos dezenove anos, a mão esquerda dele ficou presa numa máquina. O dedo mínimo foi esmagado.</w:t>
       </w:r>
     </w:p>
     <w:p>
@@ -143,7 +167,7 @@
         <w:rPr>
           <w:color w:val="000000"/>
         </w:rPr>
-        <w:t>Treze dias na estrada, com um bando de crianças pequenas na carroceria.</w:t>
+        <w:t>Ele ficou horas esperando, com a mão machucada, até o dono da fábrica aparecer para levá-lo a um médico.</w:t>
       </w:r>
     </w:p>
     <w:p>
@@ -151,7 +175,7 @@
         <w:rPr>
           <w:color w:val="000000"/>
         </w:rPr>
-        <w:t>Quando chegaram, a família encontrou Aristides. E encontrou também a outra família dele.</w:t>
+        <w:t>Quando enfim foi atendido, já não havia o que salvar. O dedo foi amputado.</w:t>
       </w:r>
     </w:p>
     <w:p>
@@ -159,7 +183,15 @@
         <w:rPr>
           <w:color w:val="000000"/>
         </w:rPr>
-        <w:t>Dona Lindu não ficou. Alguns anos depois, levou os filhos para São Paulo e criou todos praticamente sozinha.</w:t>
+        <w:t>Aquela mão de nove dedos ia aparecer milhares de vezes na televisão, décadas depois, acenando para multidões. Pouca gente sabia a história que ela carregava.</w:t>
+      </w:r>
+    </w:p>
+    <w:p>
+      <w:r>
+        <w:rPr>
+          <w:color w:val="C00000"/>
+        </w:rPr>
+        <w:t>E essa ainda era a parte fácil. Porque o jovem operário que perdeu um dedo para uma máquina estava prestes a perder alguém. E dessa vez nenhum médico ia conseguir fazer nada.</w:t>
       </w:r>
     </w:p>
     <w:p>
@@ -167,7 +199,7 @@
         <w:rPr>
           <w:color w:val="000000"/>
         </w:rPr>
-        <w:t>Aos oito anos, Lula já trabalhava. Vendia coisas na rua, perto do cais do porto. Catava lenha. Catava marisco no mangue.</w:t>
+        <w:t>No fim dos anos sessenta, Lula conheceu Maria de Lourdes.</w:t>
       </w:r>
     </w:p>
     <w:p>
@@ -175,7 +207,7 @@
         <w:rPr>
           <w:color w:val="000000"/>
         </w:rPr>
-        <w:t>Na adolescência, conseguiu uma vaga num curso do SENAI e aprendeu a profissão de torneiro mecânico.</w:t>
+        <w:t>Ela também era operária, de uma fábrica de tecidos. Tinha vindo de Minas Gerais para São Paulo tentar a vida, como ele.</w:t>
       </w:r>
     </w:p>
     <w:p>
@@ -183,15 +215,7 @@
         <w:rPr>
           <w:color w:val="000000"/>
         </w:rPr>
-        <w:t>Foi a primeira vez que alguém da família teve um diploma de profissão.</w:t>
-      </w:r>
-    </w:p>
-    <w:p>
-      <w:r>
-        <w:rPr>
-          <w:color w:val="C00000"/>
-        </w:rPr>
-        <w:t>E foi justamente numa fábrica que ele perdeu o primeiro pedaço do próprio corpo. Uma marca que o Brasil inteiro ia ver, décadas depois, cada vez que ele levantasse a mão esquerda.</w:t>
+        <w:t>Os dois se casaram. Moravam com pouco. Mas, pela primeira vez, Lula tinha uma família que era dele.</w:t>
       </w:r>
     </w:p>
     <w:p>
@@ -199,7 +223,7 @@
         <w:rPr>
           <w:color w:val="000000"/>
         </w:rPr>
-        <w:t>Mil novecentos e sessenta e quatro.</w:t>
+        <w:t>Logo veio a notícia.</w:t>
       </w:r>
     </w:p>
     <w:p>
@@ -207,7 +231,7 @@
         <w:rPr>
           <w:color w:val="000000"/>
         </w:rPr>
-        <w:t>Lula tinha dezenove anos e trabalhava numa metalúrgica em São Paulo.</w:t>
+        <w:t>Maria de Lourdes estava grávida.</w:t>
       </w:r>
     </w:p>
     <w:p>
@@ -215,7 +239,7 @@
         <w:rPr>
           <w:color w:val="000000"/>
         </w:rPr>
-        <w:t>Num dia de trabalho, a mão esquerda dele ficou presa numa máquina. O dedo mínimo foi esmagado.</w:t>
+        <w:t>O menino que cresceu sem pai ia ser pai.</w:t>
       </w:r>
     </w:p>
     <w:p>
@@ -223,87 +247,7 @@
         <w:rPr>
           <w:color w:val="000000"/>
         </w:rPr>
-        <w:t>Ele esperou horas até que o dono da fábrica aparecesse para levá-lo a um médico.</w:t>
-      </w:r>
-    </w:p>
-    <w:p>
-      <w:r>
-        <w:rPr>
-          <w:color w:val="000000"/>
-        </w:rPr>
-        <w:t>Quando finalmente foi atendido, não havia mais o que salvar. O médico amputou o que restava do dedo.</w:t>
-      </w:r>
-    </w:p>
-    <w:p>
-      <w:r>
-        <w:rPr>
-          <w:color w:val="000000"/>
-        </w:rPr>
-        <w:t>O operário de dezenove anos voltou ao trabalho com nove dedos.</w:t>
-      </w:r>
-    </w:p>
-    <w:p>
-      <w:r>
-        <w:rPr>
-          <w:color w:val="000000"/>
-        </w:rPr>
-        <w:t>Foi nessa mesma época que Lula começou a frequentar o sindicato dos metalúrgicos. Primeiro, quase sem querer, levado por um irmão mais velho. Com o tempo, cada vez mais.</w:t>
-      </w:r>
-    </w:p>
-    <w:p>
-      <w:r>
-        <w:rPr>
-          <w:color w:val="000000"/>
-        </w:rPr>
-        <w:t>E foi também nessa época que ele conheceu uma moça chamada Maria de Lourdes.</w:t>
-      </w:r>
-    </w:p>
-    <w:p>
-      <w:r>
-        <w:rPr>
-          <w:color w:val="000000"/>
-        </w:rPr>
-        <w:t>Ela era operária de uma fábrica de tecidos. Tinha vindo de Minas Gerais para São Paulo, como tanta gente naquele tempo.</w:t>
-      </w:r>
-    </w:p>
-    <w:p>
-      <w:r>
-        <w:rPr>
-          <w:color w:val="000000"/>
-        </w:rPr>
-        <w:t>Os dois se casaram por volta de mil novecentos e sessenta e nove.</w:t>
-      </w:r>
-    </w:p>
-    <w:p>
-      <w:r>
-        <w:rPr>
-          <w:color w:val="000000"/>
-        </w:rPr>
-        <w:t>Pouco tempo depois, Maria de Lourdes ficou grávida.</w:t>
-      </w:r>
-    </w:p>
-    <w:p>
-      <w:r>
-        <w:rPr>
-          <w:color w:val="000000"/>
-        </w:rPr>
-        <w:t>Era o primeiro filho do casal.</w:t>
-      </w:r>
-    </w:p>
-    <w:p>
-      <w:r>
-        <w:rPr>
-          <w:color w:val="C00000"/>
-        </w:rPr>
-        <w:t>Imagine ter vinte e poucos anos, um salário de operário e um filho a caminho. A vida finalmente começando a dar certo. Foi exatamente nesse ponto que o destino deu em Lula o primeiro golpe que ele nunca conseguiu esquecer.</w:t>
-      </w:r>
-    </w:p>
-    <w:p>
-      <w:r>
-        <w:rPr>
-          <w:color w:val="000000"/>
-        </w:rPr>
-        <w:t>No oitavo mês de gravidez, Maria de Lourdes ficou doente.</w:t>
+        <w:t>Durante oito meses, os dois esperaram aquele bebê. Até que Maria de Lourdes adoeceu.</w:t>
       </w:r>
     </w:p>
     <w:p>
@@ -319,7 +263,7 @@
         <w:rPr>
           <w:color w:val="000000"/>
         </w:rPr>
-        <w:t>Ela foi levada ao hospital.</w:t>
+        <w:t>Ela foi levada ao hospital, grávida de oito meses.</w:t>
       </w:r>
     </w:p>
     <w:p>
@@ -327,7 +271,15 @@
         <w:rPr>
           <w:color w:val="000000"/>
         </w:rPr>
-        <w:t>Lula contou o que encontrou quando chegou lá, mais de cinquenta anos depois, durante um discurso em setembro de dois mil e vinte e quatro. Lula se emocionou ao contar.</w:t>
+        <w:t>O que aconteceu dentro daquele hospital, Lula só contou em detalhes mais de cinquenta anos depois. Em setembro de dois mil e vinte e quatro, já presidente pela terceira vez, ele estava num palco anunciando um programa para mulheres grávidas.</w:t>
+      </w:r>
+    </w:p>
+    <w:p>
+      <w:r>
+        <w:rPr>
+          <w:color w:val="000000"/>
+        </w:rPr>
+        <w:t>E ele não conseguiu segurar a emoção.</w:t>
       </w:r>
     </w:p>
     <w:p>
@@ -343,7 +295,7 @@
         <w:rPr>
           <w:color w:val="000000"/>
         </w:rPr>
-        <w:t>A mulher e o filho. No mesmo dia.</w:t>
+        <w:t>A mulher e o filho. Os dois de uma vez.</w:t>
       </w:r>
     </w:p>
     <w:p>
@@ -359,7 +311,7 @@
         <w:rPr>
           <w:color w:val="000000"/>
         </w:rPr>
-        <w:t>Ele nunca aceitou o que aconteceu naquele hospital. Disse, no mesmo discurso, que tinha certeza de que a família tinha sido mal atendida por ser pobre.</w:t>
+        <w:t>No mesmo discurso, ele disse que nunca engoliu o que aconteceu. Que a mulher dele foi mal atendida porque era pobre.</w:t>
       </w:r>
     </w:p>
     <w:p>
@@ -373,9 +325,25 @@
     <w:p>
       <w:r>
         <w:rPr>
+          <w:color w:val="000000"/>
+        </w:rPr>
+        <w:t>Um operário de vinte e cinco anos, num corredor de hospital, sem poder fazer absolutamente nada.</w:t>
+      </w:r>
+    </w:p>
+    <w:p>
+      <w:r>
+        <w:rPr>
+          <w:color w:val="000000"/>
+        </w:rPr>
+        <w:t>Lula ainda não sabia. Mas aquela cena ia se repetir.</w:t>
+      </w:r>
+    </w:p>
+    <w:p>
+      <w:r>
+        <w:rPr>
           <w:color w:val="C00000"/>
         </w:rPr>
-        <w:t>Guarde essa dor. Porque foi a primeira vez que Lula perdeu alguém sem poder fazer nada. E, quase cinquenta anos depois, dentro de uma cela em Curitiba, ele ia sentir essa mesma impotência duas vezes, com apenas um mês de diferença.</w:t>
+        <w:t>Quase cinquenta anos depois, ele ia sentir de novo essa mesma dor de chegar tarde. Só que agora não ia estar num corredor de hospital. Ia estar atrás de uma grade, em Curitiba. E ia acontecer duas vezes, com apenas um mês de diferença.</w:t>
       </w:r>
     </w:p>
     <w:sectPr>

</xml_diff>

<commit_message>
Lula: Parte 1 refocada na prisão
Co-Authored-By: Claude Opus 5.5 <noreply@anthropic.com>
Claude-Session: https://claude.ai/code/session_01MJjUEEZrxQDEUifKK2vj9g
</commit_message>
<xml_diff>
--- a/roteiros/lula/Lula_Parte1.docx
+++ b/roteiros/lula/Lula_Parte1.docx
@@ -39,7 +39,7 @@
         <w:rPr>
           <w:color w:val="000000"/>
         </w:rPr>
-        <w:t>Só que essa não foi a primeira vez que Lula chegou tarde demais para alguém que ele amava. A primeira aconteceu num corredor de hospital, quando ele tinha vinte e cinco anos. E o que ele encontrou ali marcou o resto da vida dele.</w:t>
+        <w:t>Mas, para entender o peso dessas duas notícias, é preciso voltar ao dia em que a porta daquela cela se fechou pela primeira vez.</w:t>
       </w:r>
     </w:p>
     <w:p>
@@ -47,7 +47,7 @@
         <w:rPr>
           <w:color w:val="000000"/>
         </w:rPr>
-        <w:t>Para chegar até esse corredor, é preciso voltar ao sertão de Pernambuco.</w:t>
+        <w:t>Sábado, sete de abril de dois mil e dezoito.</w:t>
       </w:r>
     </w:p>
     <w:p>
@@ -55,7 +55,7 @@
         <w:rPr>
           <w:color w:val="000000"/>
         </w:rPr>
-        <w:t>Lula nasceu em mil novecentos e quarenta e cinco, num lugarejo chamado Caetés, perto de Garanhuns. Foi o sétimo filho de uma mulher que o Brasil inteiro, anos depois, ia conhecer como Dona Lindu.</w:t>
+        <w:t>São Bernardo do Campo, na Grande São Paulo.</w:t>
       </w:r>
     </w:p>
     <w:p>
@@ -63,7 +63,7 @@
         <w:rPr>
           <w:color w:val="000000"/>
         </w:rPr>
-        <w:t>O pai não estava lá para ver.</w:t>
+        <w:t>Fazia dois dias que Lula estava trancado dentro do Sindicato dos Metalúrgicos do ABC. O mesmo prédio onde, quarenta anos antes, ele tinha começado a vida política liderando greves de operários.</w:t>
       </w:r>
     </w:p>
     <w:p>
@@ -71,7 +71,7 @@
         <w:rPr>
           <w:color w:val="000000"/>
         </w:rPr>
-        <w:t>Antes de o menino nascer, Aristides tinha ido embora para Santos, trabalhar no porto. Foi com outra mulher. Com ela, teve mais dez filhos.</w:t>
+        <w:t>Do lado de fora, milhares de pessoas ocupavam a rua.</w:t>
       </w:r>
     </w:p>
     <w:p>
@@ -79,7 +79,7 @@
         <w:rPr>
           <w:color w:val="000000"/>
         </w:rPr>
-        <w:t>Lula cresceu sem saber o rosto do próprio pai. E com fome.</w:t>
+        <w:t>Na quinta-feira, o juiz Sergio Moro, da Operação Lava Jato, tinha mandado prender o ex-presidente. Lula tinha sido condenado em segunda instância no caso de um apartamento triplex no Guarujá. O prazo para ele se entregar terminava na sexta, às cinco da tarde.</w:t>
       </w:r>
     </w:p>
     <w:p>
@@ -87,7 +87,7 @@
         <w:rPr>
           <w:color w:val="000000"/>
         </w:rPr>
-        <w:t>Quando ele tinha sete anos, Dona Lindu cansou de esperar.</w:t>
+        <w:t>O prazo passou. Lula não saiu.</w:t>
       </w:r>
     </w:p>
     <w:p>
@@ -95,7 +95,7 @@
         <w:rPr>
           <w:color w:val="000000"/>
         </w:rPr>
-        <w:t>Em dezembro de mil novecentos e cinquenta e dois, ela juntou as crianças e subiu na carroceria de um caminhão pau de arara. Gente amontoada, segurando nas tábuas, atravessando o Brasil de norte a sul. Foram treze dias de estrada.</w:t>
+        <w:t>Naquele sábado de manhã, antes de qualquer coisa, ele fez questão de assistir a uma missa.</w:t>
       </w:r>
     </w:p>
     <w:p>
@@ -103,7 +103,7 @@
         <w:rPr>
           <w:color w:val="000000"/>
         </w:rPr>
-        <w:t>No fim da viagem, Dona Lindu encontrou o marido.</w:t>
+        <w:t>A missa era em homenagem à esposa, Marisa Letícia. Ela teria completado sessenta e oito anos naquele dia. Tinha morrido pouco mais de um ano antes, depois de um AVC.</w:t>
       </w:r>
     </w:p>
     <w:p>
@@ -111,7 +111,47 @@
         <w:rPr>
           <w:color w:val="000000"/>
         </w:rPr>
-        <w:t>E encontrou a outra família dele.</w:t>
+        <w:t>Lula subiu num caminhão de som, diante da multidão.</w:t>
+      </w:r>
+    </w:p>
+    <w:p>
+      <w:r>
+        <w:rPr>
+          <w:color w:val="000000"/>
+        </w:rPr>
+        <w:t>E fez o discurso mais emocionado da vida dele.</w:t>
+      </w:r>
+    </w:p>
+    <w:p>
+      <w:r>
+        <w:rPr>
+          <w:color w:val="000000"/>
+        </w:rPr>
+        <w:t>"Eu não sou um ser humano, sou uma ideia, uma ideia misturada com a ideia de vocês."</w:t>
+      </w:r>
+    </w:p>
+    <w:p>
+      <w:r>
+        <w:rPr>
+          <w:color w:val="000000"/>
+        </w:rPr>
+        <w:t>Disse que ia se entregar. Que ia provar a inocência.</w:t>
+      </w:r>
+    </w:p>
+    <w:p>
+      <w:r>
+        <w:rPr>
+          <w:color w:val="000000"/>
+        </w:rPr>
+        <w:t>Disse ainda uma frase que muita gente guardou.</w:t>
+      </w:r>
+    </w:p>
+    <w:p>
+      <w:r>
+        <w:rPr>
+          <w:color w:val="000000"/>
+        </w:rPr>
+        <w:t>"Esse pescoço aqui não baixa. Minha mãe já fez o pescoço curto pra ele não baixar."</w:t>
       </w:r>
     </w:p>
     <w:p>
@@ -119,7 +159,7 @@
         <w:rPr>
           <w:color w:val="C00000"/>
         </w:rPr>
-        <w:t>Imagine ser uma criança de sete anos, viajar treze dias para encontrar o pai, e descobrir que ele tinha outra casa, outra mulher e outros filhos. Esse foi o primeiro abandono da vida de Lula. Mas estava longe de ser o pior.</w:t>
+        <w:t>Naquele palanque, Lula estava convencido de que nada mais podia tirar dele aquilo que importava. Mas o que ele ia perder nos meses seguintes não tinha nada a ver com política. Tinha a ver com a própria família.</w:t>
       </w:r>
     </w:p>
     <w:p>
@@ -127,7 +167,7 @@
         <w:rPr>
           <w:color w:val="000000"/>
         </w:rPr>
-        <w:t>Dona Lindu não ficou. Pouco tempo depois, levou os filhos para São Paulo e criou todos praticamente sozinha.</w:t>
+        <w:t>Quando ele tentou sair do sindicato, a multidão não deixou.</w:t>
       </w:r>
     </w:p>
     <w:p>
@@ -135,7 +175,7 @@
         <w:rPr>
           <w:color w:val="000000"/>
         </w:rPr>
-        <w:t>Lula começou a trabalhar com oito anos. Vendia coisas perto do cais do porto e entrava no mangue atrás de marisco para ajudar em casa.</w:t>
+        <w:t>Militantes cercaram o carro. Bloquearam o portão. Lula voltou para dentro.</w:t>
       </w:r>
     </w:p>
     <w:p>
@@ -143,7 +183,7 @@
         <w:rPr>
           <w:color w:val="000000"/>
         </w:rPr>
-        <w:t>Na adolescência, conseguiu uma vaga no SENAI e virou torneiro mecânico. Era o primeiro diploma da família.</w:t>
+        <w:t>Só no começo da noite ele conseguiu sair a pé, no meio de seguranças, e se entregou à Polícia Federal.</w:t>
       </w:r>
     </w:p>
     <w:p>
@@ -151,7 +191,7 @@
         <w:rPr>
           <w:color w:val="000000"/>
         </w:rPr>
-        <w:t>Mas a fábrica cobrou um preço logo cedo.</w:t>
+        <w:t>Foi levado de avião para Curitiba.</w:t>
       </w:r>
     </w:p>
     <w:p>
@@ -159,7 +199,7 @@
         <w:rPr>
           <w:color w:val="000000"/>
         </w:rPr>
-        <w:t>Em mil novecentos e sessenta e quatro, aos dezenove anos, a mão esquerda dele ficou presa numa máquina. O dedo mínimo foi esmagado.</w:t>
+        <w:t>Chegou já de noite à Superintendência da Polícia Federal. Subiu até o quarto andar do prédio.</w:t>
       </w:r>
     </w:p>
     <w:p>
@@ -167,7 +207,7 @@
         <w:rPr>
           <w:color w:val="000000"/>
         </w:rPr>
-        <w:t>Ele ficou horas esperando, com a mão machucada, até o dono da fábrica aparecer para levá-lo a um médico.</w:t>
+        <w:t>Ali ficava o lugar onde ele ia passar os quinhentos e oitenta dias seguintes.</w:t>
       </w:r>
     </w:p>
     <w:p>
@@ -175,7 +215,7 @@
         <w:rPr>
           <w:color w:val="000000"/>
         </w:rPr>
-        <w:t>Quando enfim foi atendido, já não havia o que salvar. O dedo foi amputado.</w:t>
+        <w:t>Uma sala de quinze metros quadrados.</w:t>
       </w:r>
     </w:p>
     <w:p>
@@ -183,7 +223,23 @@
         <w:rPr>
           <w:color w:val="000000"/>
         </w:rPr>
-        <w:t>Aquela mão de nove dedos ia aparecer milhares de vezes na televisão, décadas depois, acenando para multidões. Pouca gente sabia a história que ela carregava.</w:t>
+        <w:t>Uma cama. Uma mesa. Um banheiro só para ele. Mais tarde, uma televisão autorizada pela Justiça.</w:t>
+      </w:r>
+    </w:p>
+    <w:p>
+      <w:r>
+        <w:rPr>
+          <w:color w:val="000000"/>
+        </w:rPr>
+        <w:t>Quinze metros quadrados é menos do que muito quarto de casa popular.</w:t>
+      </w:r>
+    </w:p>
+    <w:p>
+      <w:r>
+        <w:rPr>
+          <w:color w:val="000000"/>
+        </w:rPr>
+        <w:t>Era ali que o homem que tinha governado o Brasil por oito anos ia passar os dias e as noites.</w:t>
       </w:r>
     </w:p>
     <w:p>
@@ -191,7 +247,7 @@
         <w:rPr>
           <w:color w:val="C00000"/>
         </w:rPr>
-        <w:t>E essa ainda era a parte fácil. Porque o jovem operário que perdeu um dedo para uma máquina estava prestes a perder alguém. E dessa vez nenhum médico ia conseguir fazer nada.</w:t>
+        <w:t>Guarde esse lugar. Porque foi naquela sala que Lula recebeu as duas notícias. E nas duas vezes a pergunta foi a mesma. Ele ia poder sair para se despedir?</w:t>
       </w:r>
     </w:p>
     <w:p>
@@ -199,7 +255,7 @@
         <w:rPr>
           <w:color w:val="000000"/>
         </w:rPr>
-        <w:t>No fim dos anos sessenta, Lula conheceu Maria de Lourdes.</w:t>
+        <w:t>As regras eram rígidas.</w:t>
       </w:r>
     </w:p>
     <w:p>
@@ -207,7 +263,7 @@
         <w:rPr>
           <w:color w:val="000000"/>
         </w:rPr>
-        <w:t>Ela também era operária, de uma fábrica de tecidos. Tinha vindo de Minas Gerais para São Paulo tentar a vida, como ele.</w:t>
+        <w:t>A família podia visitá-lo uma vez por semana, às quintas-feiras. Os advogados vinham todos os dias.</w:t>
       </w:r>
     </w:p>
     <w:p>
@@ -215,7 +271,7 @@
         <w:rPr>
           <w:color w:val="000000"/>
         </w:rPr>
-        <w:t>Os dois se casaram. Moravam com pouco. Mas, pela primeira vez, Lula tinha uma família que era dele.</w:t>
+        <w:t>Do lado de fora do prédio, apoiadores montaram uma vigília que não parava. Gritavam o nome dele, alto o suficiente para ser ouvido lá em cima.</w:t>
       </w:r>
     </w:p>
     <w:p>
@@ -223,7 +279,7 @@
         <w:rPr>
           <w:color w:val="000000"/>
         </w:rPr>
-        <w:t>Logo veio a notícia.</w:t>
+        <w:t>Lula passava os dias lendo. Ao longo daquele tempo, leu mais de quarenta livros.</w:t>
       </w:r>
     </w:p>
     <w:p>
@@ -231,7 +287,7 @@
         <w:rPr>
           <w:color w:val="000000"/>
         </w:rPr>
-        <w:t>Maria de Lourdes estava grávida.</w:t>
+        <w:t>Lá fora, o Brasil estava dividido ao meio.</w:t>
       </w:r>
     </w:p>
     <w:p>
@@ -239,7 +295,7 @@
         <w:rPr>
           <w:color w:val="000000"/>
         </w:rPr>
-        <w:t>O menino que cresceu sem pai ia ser pai.</w:t>
+        <w:t>Para uma parte do país, ele era um corrupto que finalmente estava pagando. Para outra, era um preso político, vítima de um juiz que queria tirá-lo da eleição daquele ano.</w:t>
       </w:r>
     </w:p>
     <w:p>
@@ -247,7 +303,7 @@
         <w:rPr>
           <w:color w:val="000000"/>
         </w:rPr>
-        <w:t>Durante oito meses, os dois esperaram aquele bebê. Até que Maria de Lourdes adoeceu.</w:t>
+        <w:t>Essa briga ia durar anos. E só ia ter um desfecho em dois mil e vinte e um, quando o Supremo Tribunal Federal anulou as condenações de Lula e declarou que Sergio Moro tinha sido parcial no caso.</w:t>
       </w:r>
     </w:p>
     <w:p>
@@ -255,7 +311,7 @@
         <w:rPr>
           <w:color w:val="000000"/>
         </w:rPr>
-        <w:t>Era hepatite.</w:t>
+        <w:t>Mas, em abril de dois mil e dezoito, nada disso tinha acontecido ainda.</w:t>
       </w:r>
     </w:p>
     <w:p>
@@ -263,7 +319,15 @@
         <w:rPr>
           <w:color w:val="000000"/>
         </w:rPr>
-        <w:t>Ela foi levada ao hospital, grávida de oito meses.</w:t>
+        <w:t>Naquele momento, só existia a sala.</w:t>
+      </w:r>
+    </w:p>
+    <w:p>
+      <w:r>
+        <w:rPr>
+          <w:color w:val="C00000"/>
+        </w:rPr>
+        <w:t>E existia uma coisa que Lula não podia controlar de dentro dela. O tempo das pessoas que ele amava continuava correndo do lado de fora. E duas delas não iam esperar ele sair.</w:t>
       </w:r>
     </w:p>
     <w:p>
@@ -271,7 +335,7 @@
         <w:rPr>
           <w:color w:val="000000"/>
         </w:rPr>
-        <w:t>O que aconteceu dentro daquele hospital, Lula só contou em detalhes mais de cinquenta anos depois. Em setembro de dois mil e vinte e quatro, já presidente pela terceira vez, ele estava num palco anunciando um programa para mulheres grávidas.</w:t>
+        <w:t>A primeira era Genival Inácio da Silva. O irmão mais velho de Lula. Todo mundo na família chamava ele de Vavá.</w:t>
       </w:r>
     </w:p>
     <w:p>
@@ -279,7 +343,7 @@
         <w:rPr>
           <w:color w:val="000000"/>
         </w:rPr>
-        <w:t>E ele não conseguiu segurar a emoção.</w:t>
+        <w:t>Os dois tinham crescido juntos na pobreza, filhos de uma mulher do sertão de Pernambuco, Dona Lindu, que criou os filhos praticamente sozinha em São Paulo.</w:t>
       </w:r>
     </w:p>
     <w:p>
@@ -287,7 +351,7 @@
         <w:rPr>
           <w:color w:val="000000"/>
         </w:rPr>
-        <w:t>"Cheguei no hospital, encontrei minha mulher morta e meu filho morto."</w:t>
+        <w:t>Vavá estava doente. Tinha câncer.</w:t>
       </w:r>
     </w:p>
     <w:p>
@@ -295,7 +359,7 @@
         <w:rPr>
           <w:color w:val="000000"/>
         </w:rPr>
-        <w:t>A mulher e o filho. Os dois de uma vez.</w:t>
+        <w:t>A segunda pessoa era um menino.</w:t>
       </w:r>
     </w:p>
     <w:p>
@@ -303,7 +367,7 @@
         <w:rPr>
           <w:color w:val="000000"/>
         </w:rPr>
-        <w:t>Era mil novecentos e setenta e um. Lula tinha vinte e cinco anos.</w:t>
+        <w:t>O nome dele era Arthur. Neto de Lula.</w:t>
       </w:r>
     </w:p>
     <w:p>
@@ -311,31 +375,7 @@
         <w:rPr>
           <w:color w:val="000000"/>
         </w:rPr>
-        <w:t>No mesmo discurso, ele disse que nunca engoliu o que aconteceu. Que a mulher dele foi mal atendida porque era pobre.</w:t>
-      </w:r>
-    </w:p>
-    <w:p>
-      <w:r>
-        <w:rPr>
-          <w:color w:val="000000"/>
-        </w:rPr>
-        <w:t>"Eu tenho certeza absoluta que foi relaxamento, que foi falta de trato."</w:t>
-      </w:r>
-    </w:p>
-    <w:p>
-      <w:r>
-        <w:rPr>
-          <w:color w:val="000000"/>
-        </w:rPr>
-        <w:t>Um operário de vinte e cinco anos, num corredor de hospital, sem poder fazer absolutamente nada.</w:t>
-      </w:r>
-    </w:p>
-    <w:p>
-      <w:r>
-        <w:rPr>
-          <w:color w:val="000000"/>
-        </w:rPr>
-        <w:t>Lula ainda não sabia. Mas aquela cena ia se repetir.</w:t>
+        <w:t>Quando o avô entrou naquela sala, em abril de dois mil e dezoito, ninguém imaginava que Arthur nunca mais ia ver Lula livre.</w:t>
       </w:r>
     </w:p>
     <w:p>
@@ -343,7 +383,7 @@
         <w:rPr>
           <w:color w:val="C00000"/>
         </w:rPr>
-        <w:t>Quase cinquenta anos depois, ele ia sentir de novo essa mesma dor de chegar tarde. Só que agora não ia estar num corredor de hospital. Ia estar atrás de uma grade, em Curitiba. E ia acontecer duas vezes, com apenas um mês de diferença.</w:t>
+        <w:t>Dois nomes. Um irmão de setenta e nove anos e um neto de sete. Os dois iam morrer enquanto Lula estava naquela sala, com apenas um mês de diferença. E o que aconteceu quando ele pediu para sair é uma das passagens mais cruéis dessa história.</w:t>
       </w:r>
     </w:p>
     <w:sectPr>

</xml_diff>

<commit_message>
Lula: ajustes Parte 1
Co-Authored-By: Claude Opus 5.5 <noreply@anthropic.com>
Claude-Session: https://claude.ai/code/session_01MJjUEEZrxQDEUifKK2vj9g
</commit_message>
<xml_diff>
--- a/roteiros/lula/Lula_Parte1.docx
+++ b/roteiros/lula/Lula_Parte1.docx
@@ -159,7 +159,7 @@
         <w:rPr>
           <w:color w:val="C00000"/>
         </w:rPr>
-        <w:t>Naquele palanque, Lula estava convencido de que nada mais podia tirar dele aquilo que importava. Mas o que ele ia perder nos meses seguintes não tinha nada a ver com política. Tinha a ver com a própria família.</w:t>
+        <w:t>Naquele palanque, Lula estava convencido de que nada mais podia tirar dele aquilo que importava. Mas o que ele ia perder nos meses seguintes estava longe da política. Estava dentro da própria família.</w:t>
       </w:r>
     </w:p>
     <w:p>
@@ -344,14 +344,6 @@
           <w:color w:val="000000"/>
         </w:rPr>
         <w:t>Os dois tinham crescido juntos na pobreza, filhos de uma mulher do sertão de Pernambuco, Dona Lindu, que criou os filhos praticamente sozinha em São Paulo.</w:t>
-      </w:r>
-    </w:p>
-    <w:p>
-      <w:r>
-        <w:rPr>
-          <w:color w:val="000000"/>
-        </w:rPr>
-        <w:t>Vavá estava doente. Tinha câncer.</w:t>
       </w:r>
     </w:p>
     <w:p>

</xml_diff>